<commit_message>
feat: centralize assets and move module paths into module config
</commit_message>
<xml_diff>
--- a/src-tauri/resources/templates/achados-e-perdidos/template.docx
+++ b/src-tauri/resources/templates/achados-e-perdidos/template.docx
@@ -91,7 +91,7 @@
         <w:spacing w:after="0" w:line="240" w:lineRule="auto"/>
         <w:jc w:val="right"/>
         <w:rPr>
-          <w:rFonts w:ascii="Arial Unicode MS" w:eastAsia="Arial Unicode MS" w:hAnsi="Arial Unicode MS" w:cs="Arial Unicode MS"/>
+          <w:rFonts w:ascii="Calibri" w:eastAsia="Arial Unicode MS" w:hAnsi="Calibri" w:cs="Calibri"/>
           <w:b/>
           <w:noProof/>
           <w:color w:val="70AD47" w:themeColor="accent6"/>
@@ -102,7 +102,7 @@
       </w:pPr>
       <w:r>
         <w:rPr>
-          <w:rFonts w:ascii="Arial Unicode MS" w:eastAsia="Arial Unicode MS" w:hAnsi="Arial Unicode MS" w:cs="Arial Unicode MS"/>
+          <w:rFonts w:ascii="Calibri" w:eastAsia="Arial Unicode MS" w:hAnsi="Calibri" w:cs="Calibri"/>
           <w:b/>
           <w:noProof/>
           <w:color w:val="44546A" w:themeColor="text2"/>
@@ -114,7 +114,7 @@
       </w:r>
       <w:r>
         <w:rPr>
-          <w:rFonts w:ascii="Arial Unicode MS" w:eastAsia="Arial Unicode MS" w:hAnsi="Arial Unicode MS" w:cs="Arial Unicode MS"/>
+          <w:rFonts w:ascii="Calibri" w:eastAsia="Arial Unicode MS" w:hAnsi="Calibri" w:cs="Calibri"/>
           <w:b/>
           <w:noProof/>
           <w:color w:val="70AD47" w:themeColor="accent6"/>
@@ -136,7 +136,7 @@
       </w:pPr>
       <w:r>
         <w:rPr>
-          <w:rFonts w:ascii="Arial Unicode MS" w:eastAsia="Arial Unicode MS" w:hAnsi="Arial Unicode MS" w:cs="Arial Unicode MS"/>
+          <w:rFonts w:eastAsia="Arial Unicode MS" w:cstheme="minorHAnsi"/>
           <w:b/>
           <w:bCs/>
           <w:noProof/>
@@ -351,23 +351,15 @@
       </w:r>
       <w:r>
         <w:rPr>
-          <w:rFonts w:ascii="Arial Unicode MS" w:eastAsia="Arial Unicode MS" w:hAnsi="Arial Unicode MS" w:cs="Arial Unicode MS"/>
-          <w:sz w:val="24"/>
-          <w:szCs w:val="24"/>
-        </w:rPr>
-        <w:t>Ex</w:t>
-      </w:r>
-      <w:r>
-        <w:rPr>
-          <w:rFonts w:ascii="Arial Unicode MS" w:eastAsia="Arial Unicode MS" w:hAnsi="Arial Unicode MS" w:cs="Arial Unicode MS"/>
-          <w:sz w:val="24"/>
-          <w:szCs w:val="24"/>
-        </w:rPr>
-        <w:t>ma</w:t>
-      </w:r>
-      <w:r>
-        <w:rPr>
-          <w:rFonts w:ascii="Arial Unicode MS" w:eastAsia="Arial Unicode MS" w:hAnsi="Arial Unicode MS" w:cs="Arial Unicode MS"/>
+          <w:rFonts w:eastAsia="Arial Unicode MS" w:cstheme="minorHAnsi"/>
+          <w:sz w:val="24"/>
+          <w:szCs w:val="24"/>
+        </w:rPr>
+        <w:t>Exma</w:t>
+      </w:r>
+      <w:r>
+        <w:rPr>
+          <w:rFonts w:eastAsia="Arial Unicode MS" w:cstheme="minorHAnsi"/>
           <w:sz w:val="24"/>
           <w:szCs w:val="24"/>
         </w:rPr>
@@ -375,7 +367,7 @@
       </w:r>
       <w:r>
         <w:rPr>
-          <w:rFonts w:ascii="Arial Unicode MS" w:eastAsia="Arial Unicode MS" w:hAnsi="Arial Unicode MS" w:cs="Arial Unicode MS"/>
+          <w:rFonts w:eastAsia="Arial Unicode MS" w:cstheme="minorHAnsi"/>
           <w:sz w:val="24"/>
           <w:szCs w:val="24"/>
         </w:rPr>

</xml_diff>